<commit_message>
Set warehouse tent proposal price
</commit_message>
<xml_diff>
--- a/docs/warehouse-tent-installation-proposal.docx
+++ b/docs/warehouse-tent-installation-proposal.docx
@@ -555,14 +555,7 @@
         <w:spacing w:before="0" w:after="200" w:line="300" w:lineRule="auto"/>
       </w:pPr>
       <w:r>
-        <w:rPr>
-          <w:rFonts w:ascii="Calibri" w:hAnsi="Calibri"/>
-          <w:b/>
-          <w:i w:val="0"/>
-          <w:color w:val="0B2545"/>
-          <w:sz w:val="23"/>
-        </w:rPr>
-        <w:t>Recommendation: use the three-worker active production-line plan. The third worker should be an active floater who relieves bottlenecks after layout and staging, not a passive checker.</w:t>
+        <w:t>Proposal price: $1,800. Recommendation: use the three-worker active production-line plan. The third worker should be an active floater who relieves bottlenecks after layout and staging, not a passive checker.</w:t>
       </w:r>
     </w:p>
     <w:p>
@@ -2199,6 +2192,11 @@
       </w:r>
     </w:p>
     <w:p>
+      <w:r>
+        <w:br w:type="page"/>
+      </w:r>
+    </w:p>
+    <w:p>
       <w:pPr>
         <w:pStyle w:val="Heading1"/>
       </w:pPr>
@@ -2212,12 +2210,7 @@
         <w:jc w:val="both"/>
       </w:pPr>
       <w:r>
-        <w:rPr>
-          <w:rFonts w:ascii="Calibri" w:hAnsi="Calibri"/>
-          <w:color w:val="000000"/>
-          <w:sz w:val="22"/>
-        </w:rPr>
-        <w:t>Final price should be confirmed after the site surface, anchoring method, and crew availability are verified. The labor plan above can be used to price the work once the final crew size and install window are selected.</w:t>
+        <w:t>The fixed proposal price is $1,800 for labor to lay out, stage, assemble, anchor, inspect, and clean up after eight temporary warehouse tents using the recommended three-worker plan. Materials, weather-delay return trips, missing parts, concrete drilling, and ballast are excluded unless separately approved.</w:t>
       </w:r>
     </w:p>
     <w:tbl>
@@ -2304,6 +2297,7 @@
         </w:tc>
       </w:tr>
       <w:tr>
+        <w:trPr/>
         <w:tc>
           <w:tcPr>
             <w:tcW w:type="dxa" w:w="3300"/>
@@ -2344,24 +2338,14 @@
             <w:vAlign w:val="center"/>
           </w:tcPr>
           <w:p>
-            <w:pPr>
-              <w:spacing w:before="0" w:after="0" w:line="276" w:lineRule="auto"/>
-              <w:jc w:val="left"/>
-            </w:pPr>
-            <w:r/>
             <w:r>
-              <w:rPr>
-                <w:rFonts w:ascii="Calibri" w:hAnsi="Calibri"/>
-                <w:b w:val="0"/>
-                <w:color w:val="000000"/>
-                <w:sz w:val="19"/>
-              </w:rPr>
-              <w:t>To be priced</w:t>
+              <w:t>Included</w:t>
             </w:r>
           </w:p>
         </w:tc>
       </w:tr>
       <w:tr>
+        <w:trPr/>
         <w:tc>
           <w:tcPr>
             <w:tcW w:type="dxa" w:w="3300"/>
@@ -2402,24 +2386,14 @@
             <w:vAlign w:val="center"/>
           </w:tcPr>
           <w:p>
-            <w:pPr>
-              <w:spacing w:before="0" w:after="0" w:line="276" w:lineRule="auto"/>
-              <w:jc w:val="left"/>
-            </w:pPr>
-            <w:r/>
             <w:r>
-              <w:rPr>
-                <w:rFonts w:ascii="Calibri" w:hAnsi="Calibri"/>
-                <w:b w:val="0"/>
-                <w:color w:val="000000"/>
-                <w:sz w:val="19"/>
-              </w:rPr>
-              <w:t>To be confirmed by surface type</w:t>
+              <w:t>Excluded unless separately approved</w:t>
             </w:r>
           </w:p>
         </w:tc>
       </w:tr>
       <w:tr>
+        <w:trPr/>
         <w:tc>
           <w:tcPr>
             <w:tcW w:type="dxa" w:w="3300"/>
@@ -2460,24 +2434,14 @@
             <w:vAlign w:val="center"/>
           </w:tcPr>
           <w:p>
-            <w:pPr>
-              <w:spacing w:before="0" w:after="0" w:line="276" w:lineRule="auto"/>
-              <w:jc w:val="left"/>
-            </w:pPr>
-            <w:r/>
             <w:r>
-              <w:rPr>
-                <w:rFonts w:ascii="Calibri" w:hAnsi="Calibri"/>
-                <w:b w:val="0"/>
-                <w:color w:val="000000"/>
-                <w:sz w:val="19"/>
-              </w:rPr>
-              <w:t>To be priced if needed</w:t>
+              <w:t>Excluded unless separately approved</w:t>
             </w:r>
           </w:p>
         </w:tc>
       </w:tr>
       <w:tr>
+        <w:trPr/>
         <w:tc>
           <w:tcPr>
             <w:tcW w:type="dxa" w:w="3300"/>
@@ -2518,19 +2482,8 @@
             <w:vAlign w:val="center"/>
           </w:tcPr>
           <w:p>
-            <w:pPr>
-              <w:spacing w:before="0" w:after="0" w:line="276" w:lineRule="auto"/>
-              <w:jc w:val="left"/>
-            </w:pPr>
-            <w:r/>
             <w:r>
-              <w:rPr>
-                <w:rFonts w:ascii="Calibri" w:hAnsi="Calibri"/>
-                <w:b w:val="0"/>
-                <w:color w:val="000000"/>
-                <w:sz w:val="19"/>
-              </w:rPr>
-              <w:t>To be confirmed</w:t>
+              <w:t>$1,800</w:t>
             </w:r>
           </w:p>
         </w:tc>

</xml_diff>

<commit_message>
Revise warehouse tent proposal price
</commit_message>
<xml_diff>
--- a/docs/warehouse-tent-installation-proposal.docx
+++ b/docs/warehouse-tent-installation-proposal.docx
@@ -555,7 +555,7 @@
         <w:spacing w:before="0" w:after="200" w:line="300" w:lineRule="auto"/>
       </w:pPr>
       <w:r>
-        <w:t>Proposal price: $1,800. Recommendation: use the three-worker active production-line plan. The third worker should be an active floater who relieves bottlenecks after layout and staging, not a passive checker.</w:t>
+        <w:t>Proposal price: $1,825. Recommendation: use the three-worker active production-line plan. The third worker should be an active floater who relieves bottlenecks after layout and staging, not a passive checker.</w:t>
       </w:r>
     </w:p>
     <w:p>
@@ -2210,7 +2210,7 @@
         <w:jc w:val="both"/>
       </w:pPr>
       <w:r>
-        <w:t>The fixed proposal price is $1,800 for labor to lay out, stage, assemble, anchor, inspect, and clean up after eight temporary warehouse tents using the recommended three-worker plan. Materials, weather-delay return trips, missing parts, concrete drilling, and ballast are excluded unless separately approved.</w:t>
+        <w:t>The fixed proposal price is $1,825 for labor to lay out, stage, assemble, anchor, inspect, and clean up after eight temporary warehouse tents using the recommended three-worker plan. Materials, weather-delay return trips, missing parts, concrete drilling, and ballast are excluded unless separately approved.</w:t>
       </w:r>
     </w:p>
     <w:tbl>
@@ -2483,7 +2483,7 @@
           </w:tcPr>
           <w:p>
             <w:r>
-              <w:t>$1,800</w:t>
+              <w:t>$1,825</w:t>
             </w:r>
           </w:p>
         </w:tc>

</xml_diff>